<commit_message>
Docs: next entry id, Intune step vs. image builds
- CONTRIBUTING: the "next unused id" example moves from 36 (now taken)
  to 37.
- Entry 36 notes + README image section: run Intune enrollment on the
  booted machine, not in a Cubic/live-build chroot ('systemctl --now'
  needs a running systemd, and each device must register with its own
  user's sign-in).
- Regenerated install.sh and the Word guide.

Co-Authored-By: Claude Opus 5.5 <noreply@anthropic.com>
</commit_message>
<xml_diff>
--- a/docs/PopOS-Customization-Guide.docx
+++ b/docs/PopOS-Customization-Guide.docx
@@ -20,7 +20,7 @@
     </w:p>
     <w:p>
       <w:r>
-        <w:t xml:space="preserve">Generated: 2026-10-22 10:37 UTC</w:t>
+        <w:t xml:space="preserve">Generated: 2026-10-22 11:09 UTC</w:t>
       </w:r>
     </w:p>
     <w:p>
@@ -5538,7 +5538,7 @@
         <w:rPr>
           <w:i/>
         </w:rPr>
-        <w:t xml:space="preserve">Note: VERIFIED ON THIS BUILD (2026-10-22): the wizard run of this entry exited 0 and installed intune-portal 1.2609.5-noble, microsoft-identity-broker 3.0.2-noble, microsoft-edge-stable 155.0.4283.62-1 and libpam-pwquality 1.4.5-3build1. intune-daemon.socket, microsoft-identity-device-broker (system) and intune-agent.timer (user) were all active afterwards. After signing in through the Intune app, 'dsreg --status' reported 'Device Registration Status: Registered' and 'PRT Present: YES', and ~/.config/intune/registration.toml was written. REGISTERED IS NOT THE SAME AS COMPLIANT. Registration puts the device in Entra ID. A Conditional Access rule that requires a compliant device also needs the tenant's Linux compliance policy to pass; the Intune app shows the result and lists any failing setting. The intune-agent timer re-checks about every hour, so a fixed setting can take up to an hour to show as compliant (or use 'Refresh' in the app). POP!_OS CAVEATS -- read before relying on Conditional Access: (1) Microsoft supports Intune on Ubuntu Desktop, not Pop!_OS. The agent reports the distribution from /etc/os-release, so this machine shows as 'Pop!_OS 24.04 LTS'. If the compliance policy's 'Allowed distributions' only lists Ubuntu, the device will be non-compliant until an admin adds Pop!_OS. Do not edit /etc/os-release to get around it -- that misreports the device to your organisation and breaks Pop!_OS tooling. (2) The agent checks disk encryption by reading /proc/mounts for dm-crypt. A stock Pop!_OS install without the 'Encrypt drive' option, like the one this log was built on (only swap is encrypted), fails a 'Require device encryption' policy. That cannot be fixed by a script; it needs a reinstall with full-disk encryption. (3) The password policy check reads pam_pwquality settings (minlen, dcredit, ucredit, lcredit, ocredit) from /etc/security/pwquality.conf and the PAM stack. This entry installs the module but does not set values, because they must match your tenant's policy; if the app reports the password setting as failing, set those values in /etc/security/pwquality.conf, then change your password so the new rule applies. WHAT THE PACKAGES DO TO THE SYSTEM: intune-portal adds a PAM profile (pam_intune.so, applied with pam-auth-update), a polkit action, the system intune-daemon socket and the per-user intune-agent timer. The 'intune-daemon.service is a disabled or a static unit' message during install is expected -- the daemon is socket-activated. Its postinst also removes Microsoft repo files it would duplicate. microsoft-identity-broker adds the system device broker, the per-user broker (started on demand over D-Bus) and the 'dsreg' tool. Tokens are stored in GNOME Keyring through the Secret Service, which COSMIC runs by default. EDGE FOR WEB APPS: Conditional Access sees the device only from Edge. Sign in to the Edge profile with the same work account. Chromium (entry 7) will be blocked by 'require compliant device' rules. Edge is the one browser this build allows that is not from the Pop!_OS/xtradeb repos, and it is here only for this. Its package deletes the bootstrap microsoft-edge.list and writes its own /etc/apt/sources.list.d/microsoft-edge.sources and /usr/share/keyrings/microsoft-edge.gpg -- expected, not a duplicate. THE SIGN-IN IS DELIBERATELY NOT SCRIPTED: it needs live credentials and MFA, and nothing from it may go into entries.json or install.sh. registration.toml holds tenant and device IDs -- never commit it. UNENROLL / REVERT: in the Intune app use 'Remove device' (it retires the device in Intune and deletes it from Entra ID), then 'sudo apt purge intune-portal microsoft-identity-broker microsoft-edge-stable' and 'rm -rf ~/.config/intune ~/.local/state/intune'. Purging without removing the device first leaves a stale device in Entra ID for an admin to delete. VERIFY: dsreg --status (expect 'Registered' and 'PRT Present: YES'); systemctl status intune-daemon.socket microsoft-identity-device-broker; systemctl --user status intune-agent.timer; the Intune app's home screen for compliance status; and the device under Entra admin center -&gt; Devices -&gt; All devices.</w:t>
+        <w:t xml:space="preserve">Note: VERIFIED ON THIS BUILD (2026-10-22): the wizard run of this entry exited 0 and installed intune-portal 1.2609.5-noble, microsoft-identity-broker 3.0.2-noble, microsoft-edge-stable 155.0.4283.62-1 and libpam-pwquality 1.4.5-3build1. intune-daemon.socket, microsoft-identity-device-broker (system) and intune-agent.timer (user) were all active afterwards. After signing in through the Intune app, 'dsreg --status' reported 'Device Registration Status: Registered' and 'PRT Present: YES', and ~/.config/intune/registration.toml was written. REGISTERED IS NOT THE SAME AS COMPLIANT. Registration puts the device in Entra ID. A Conditional Access rule that requires a compliant device also needs the tenant's Linux compliance policy to pass; the Intune app shows the result and lists any failing setting. The intune-agent timer re-checks about every hour, so a fixed setting can take up to an hour to show as compliant (or use 'Refresh' in the app). POP!_OS CAVEATS -- read before relying on Conditional Access: (1) Microsoft supports Intune on Ubuntu Desktop, not Pop!_OS. The agent reports the distribution from /etc/os-release, so this machine shows as 'Pop!_OS 24.04 LTS'. If the compliance policy's 'Allowed distributions' only lists Ubuntu, the device will be non-compliant until an admin adds Pop!_OS. Do not edit /etc/os-release to get around it -- that misreports the device to your organisation and breaks Pop!_OS tooling. (2) The agent checks disk encryption by reading /proc/mounts for dm-crypt. A stock Pop!_OS install without the 'Encrypt drive' option, like the one this log was built on (only swap is encrypted), fails a 'Require device encryption' policy. That cannot be fixed by a script; it needs a reinstall with full-disk encryption. (3) The password policy check reads pam_pwquality settings (minlen, dcredit, ucredit, lcredit, ocredit) from /etc/security/pwquality.conf and the PAM stack. This entry installs the module but does not set values, because they must match your tenant's policy; if the app reports the password setting as failing, set those values in /etc/security/pwquality.conf, then change your password so the new rule applies. WHAT THE PACKAGES DO TO THE SYSTEM: intune-portal adds a PAM profile (pam_intune.so, applied with pam-auth-update), a polkit action, the system intune-daemon socket and the per-user intune-agent timer. The 'intune-daemon.service is a disabled or a static unit' message during install is expected -- the daemon is socket-activated. Its postinst also removes Microsoft repo files it would duplicate. microsoft-identity-broker adds the system device broker, the per-user broker (started on demand over D-Bus) and the 'dsreg' tool. Tokens are stored in GNOME Keyring through the Secret Service, which COSMIC runs by default. EDGE FOR WEB APPS: Conditional Access sees the device only from Edge. Sign in to the Edge profile with the same work account. Chromium (entry 7) will be blocked by 'require compliant device' rules. Edge is the one browser this build allows that is not from the Pop!_OS/xtradeb repos, and it is here only for this. Its package deletes the bootstrap microsoft-edge.list and writes its own /etc/apt/sources.list.d/microsoft-edge.sources and /usr/share/keyrings/microsoft-edge.gpg -- expected, not a duplicate. THE SIGN-IN IS DELIBERATELY NOT SCRIPTED: it needs live credentials and MFA, and nothing from it may go into entries.json or install.sh. registration.toml holds tenant and device IDs -- never commit it. UNENROLL / REVERT: in the Intune app use 'Remove device' (it retires the device in Intune and deletes it from Entra ID), then 'sudo apt purge intune-portal microsoft-identity-broker microsoft-edge-stable' and 'rm -rf ~/.config/intune ~/.local/state/intune'. Purging without removing the device first leaves a stale device in Entra ID for an admin to delete. NOT FOR IMAGE BUILDS: run this entry on the booted machine, not inside a Cubic or live-build chroot. Step 4's 'systemctl --now' needs a running systemd and fails in a chroot, which stops the script under 'set -e'. Enrollment also belongs to one machine and one user: each machine registers itself when its user signs in, and a registration must never be copied into an image. On a respin, skip entry 36 in the chroot and run './install-wizard.py --only 36' after first boot. VERIFY: dsreg --status (expect 'Registered' and 'PRT Present: YES'); systemctl status intune-daemon.socket microsoft-identity-device-broker; systemctl --user status intune-agent.timer; the Intune app's home screen for compliance status; and the device under Entra admin center -&gt; Devices -&gt; All devices.</w:t>
       </w:r>
     </w:p>
     <w:p/>

</xml_diff>

<commit_message>
Add entries 37-38: Microsoft Edge and default-browser choice
- 37: Microsoft Edge as an optional native .deb from Microsoft's repo,
  installable without the Intune entry. Notes cover the App Library
  (Edge lands in the Office folder; move it to Library Home by hand).
- 38: DEFAULT_BROWSER param (chromium | edge) sets mimeapps/xdg defaults,
  pins x-www-browser and gnome-www-browser in manual mode (Edge's
  priority 200 otherwise takes them over), and, for chromium, turns off
  Edge's "make default" prompt via a managed policy.
- README/CONTRIBUTING updated; install.sh and guide regenerated.

Co-Authored-By: Claude Opus 5.5 <noreply@anthropic.com>
</commit_message>
<xml_diff>
--- a/docs/PopOS-Customization-Guide.docx
+++ b/docs/PopOS-Customization-Guide.docx
@@ -20,7 +20,7 @@
     </w:p>
     <w:p>
       <w:r>
-        <w:t xml:space="preserve">Generated: 2026-10-22 11:09 UTC</w:t>
+        <w:t xml:space="preserve">Generated: 2026-10-23 16:26 UTC</w:t>
       </w:r>
     </w:p>
     <w:p>
@@ -5539,6 +5539,466 @@
           <w:i/>
         </w:rPr>
         <w:t xml:space="preserve">Note: VERIFIED ON THIS BUILD (2026-10-22): the wizard run of this entry exited 0 and installed intune-portal 1.2609.5-noble, microsoft-identity-broker 3.0.2-noble, microsoft-edge-stable 155.0.4283.62-1 and libpam-pwquality 1.4.5-3build1. intune-daemon.socket, microsoft-identity-device-broker (system) and intune-agent.timer (user) were all active afterwards. After signing in through the Intune app, 'dsreg --status' reported 'Device Registration Status: Registered' and 'PRT Present: YES', and ~/.config/intune/registration.toml was written. REGISTERED IS NOT THE SAME AS COMPLIANT. Registration puts the device in Entra ID. A Conditional Access rule that requires a compliant device also needs the tenant's Linux compliance policy to pass; the Intune app shows the result and lists any failing setting. The intune-agent timer re-checks about every hour, so a fixed setting can take up to an hour to show as compliant (or use 'Refresh' in the app). POP!_OS CAVEATS -- read before relying on Conditional Access: (1) Microsoft supports Intune on Ubuntu Desktop, not Pop!_OS. The agent reports the distribution from /etc/os-release, so this machine shows as 'Pop!_OS 24.04 LTS'. If the compliance policy's 'Allowed distributions' only lists Ubuntu, the device will be non-compliant until an admin adds Pop!_OS. Do not edit /etc/os-release to get around it -- that misreports the device to your organisation and breaks Pop!_OS tooling. (2) The agent checks disk encryption by reading /proc/mounts for dm-crypt. A stock Pop!_OS install without the 'Encrypt drive' option, like the one this log was built on (only swap is encrypted), fails a 'Require device encryption' policy. That cannot be fixed by a script; it needs a reinstall with full-disk encryption. (3) The password policy check reads pam_pwquality settings (minlen, dcredit, ucredit, lcredit, ocredit) from /etc/security/pwquality.conf and the PAM stack. This entry installs the module but does not set values, because they must match your tenant's policy; if the app reports the password setting as failing, set those values in /etc/security/pwquality.conf, then change your password so the new rule applies. WHAT THE PACKAGES DO TO THE SYSTEM: intune-portal adds a PAM profile (pam_intune.so, applied with pam-auth-update), a polkit action, the system intune-daemon socket and the per-user intune-agent timer. The 'intune-daemon.service is a disabled or a static unit' message during install is expected -- the daemon is socket-activated. Its postinst also removes Microsoft repo files it would duplicate. microsoft-identity-broker adds the system device broker, the per-user broker (started on demand over D-Bus) and the 'dsreg' tool. Tokens are stored in GNOME Keyring through the Secret Service, which COSMIC runs by default. EDGE FOR WEB APPS: Conditional Access sees the device only from Edge. Sign in to the Edge profile with the same work account. Chromium (entry 7) will be blocked by 'require compliant device' rules. Edge is the one browser this build allows that is not from the Pop!_OS/xtradeb repos, and it is here only for this. Its package deletes the bootstrap microsoft-edge.list and writes its own /etc/apt/sources.list.d/microsoft-edge.sources and /usr/share/keyrings/microsoft-edge.gpg -- expected, not a duplicate. THE SIGN-IN IS DELIBERATELY NOT SCRIPTED: it needs live credentials and MFA, and nothing from it may go into entries.json or install.sh. registration.toml holds tenant and device IDs -- never commit it. UNENROLL / REVERT: in the Intune app use 'Remove device' (it retires the device in Intune and deletes it from Entra ID), then 'sudo apt purge intune-portal microsoft-identity-broker microsoft-edge-stable' and 'rm -rf ~/.config/intune ~/.local/state/intune'. Purging without removing the device first leaves a stale device in Entra ID for an admin to delete. NOT FOR IMAGE BUILDS: run this entry on the booted machine, not inside a Cubic or live-build chroot. Step 4's 'systemctl --now' needs a running systemd and fails in a chroot, which stops the script under 'set -e'. Enrollment also belongs to one machine and one user: each machine registers itself when its user signs in, and a registration must never be copied into an image. On a respin, skip entry 36 in the chroot and run './install-wizard.py --only 36' after first boot. VERIFY: dsreg --status (expect 'Registered' and 'PRT Present: YES'); systemctl status intune-daemon.socket microsoft-identity-device-broker; systemctl --user status intune-agent.timer; the Intune app's home screen for compliance status; and the device under Entra admin center -&gt; Devices -&gt; All devices.</w:t>
+      </w:r>
+    </w:p>
+    <w:p/>
+    <w:p>
+      <w:pPr>
+        <w:pStyle w:val="Heading2"/>
+      </w:pPr>
+      <w:r>
+        <w:t xml:space="preserve">37. Microsoft Edge (native .deb from Microsoft's repo, optional second browser)</w:t>
+      </w:r>
+    </w:p>
+    <w:p>
+      <w:r>
+        <w:rPr>
+          <w:i/>
+        </w:rPr>
+        <w:t xml:space="preserve">Category: Browsers   |   Date: 2026-10-23   |   Method: apt + microsoft edge repo</w:t>
+      </w:r>
+    </w:p>
+    <w:p>
+      <w:r>
+        <w:t xml:space="preserve">Installs Microsoft Edge as an optional second browser next to Chromium (entry 7), from Microsoft's own apt repository rather than a snap or Flatpak -- same native-packages-only rule as the rest of this build. Edge is useful on its own (Microsoft 365 web apps, sites that only test against Edge) and is required for Intune Conditional Access (entry 36, which also installs it). This entry lets Edge be picked on its own without enrolling in Intune. Installing Edge does NOT change the default browser for web links; see entry 38 to choose between Chromium and Edge.</w:t>
+      </w:r>
+    </w:p>
+    <w:p>
+      <w:pPr>
+        <w:pStyle w:val="Heading3"/>
+      </w:pPr>
+      <w:r>
+        <w:t xml:space="preserve">Commands</w:t>
+      </w:r>
+    </w:p>
+    <w:p>
+      <w:pPr>
+        <w:pStyle w:val="Code"/>
+      </w:pPr>
+      <w:r>
+        <w:t xml:space="preserve"># 1) Microsoft Edge repo. Bootstrap only: on install, Edge's own package</w:t>
+      </w:r>
+    </w:p>
+    <w:p>
+      <w:pPr>
+        <w:pStyle w:val="Code"/>
+      </w:pPr>
+      <w:r>
+        <w:t xml:space="preserve">#    replaces it with /etc/apt/sources.list.d/microsoft-edge.sources (own</w:t>
+      </w:r>
+    </w:p>
+    <w:p>
+      <w:pPr>
+        <w:pStyle w:val="Code"/>
+      </w:pPr>
+      <w:r>
+        <w:t xml:space="preserve">#    keyring, repos/edge-stable). Written only when no Edge source exists yet,</w:t>
+      </w:r>
+    </w:p>
+    <w:p>
+      <w:pPr>
+        <w:pStyle w:val="Code"/>
+      </w:pPr>
+      <w:r>
+        <w:t xml:space="preserve">#    so a re-run (or a machine that already ran entry 36) adds no duplicate.</w:t>
+      </w:r>
+    </w:p>
+    <w:p>
+      <w:pPr>
+        <w:pStyle w:val="Code"/>
+      </w:pPr>
+      <w:r>
+        <w:t xml:space="preserve">if ! ls /etc/apt/sources.list.d/microsoft-edge.* &gt; /dev/null 2&gt;&amp;1; then</w:t>
+      </w:r>
+    </w:p>
+    <w:p>
+      <w:pPr>
+        <w:pStyle w:val="Code"/>
+      </w:pPr>
+      <w:r>
+        <w:t xml:space="preserve">    [ -f /usr/share/keyrings/microsoft.gpg ] || \</w:t>
+      </w:r>
+    </w:p>
+    <w:p>
+      <w:pPr>
+        <w:pStyle w:val="Code"/>
+      </w:pPr>
+      <w:r>
+        <w:t xml:space="preserve">        wget -qO- https://packages.microsoft.com/keys/microsoft.asc | gpg --dearmor \</w:t>
+      </w:r>
+    </w:p>
+    <w:p>
+      <w:pPr>
+        <w:pStyle w:val="Code"/>
+      </w:pPr>
+      <w:r>
+        <w:t xml:space="preserve">        | sudo install -D -o root -g root -m 644 /dev/stdin /usr/share/keyrings/microsoft.gpg</w:t>
+      </w:r>
+    </w:p>
+    <w:p>
+      <w:pPr>
+        <w:pStyle w:val="Code"/>
+      </w:pPr>
+      <w:r>
+        <w:t xml:space="preserve">    echo "deb [arch=amd64 signed-by=/usr/share/keyrings/microsoft.gpg] https://packages.microsoft.com/repos/edge stable main" \</w:t>
+      </w:r>
+    </w:p>
+    <w:p>
+      <w:pPr>
+        <w:pStyle w:val="Code"/>
+      </w:pPr>
+      <w:r>
+        <w:t xml:space="preserve">        | sudo tee /etc/apt/sources.list.d/microsoft-edge.list &gt; /dev/null</w:t>
+      </w:r>
+    </w:p>
+    <w:p>
+      <w:pPr>
+        <w:pStyle w:val="Code"/>
+      </w:pPr>
+      <w:r>
+        <w:t xml:space="preserve">fi</w:t>
+      </w:r>
+    </w:p>
+    <w:p>
+      <w:pPr>
+        <w:pStyle w:val="Code"/>
+      </w:pPr>
+      <w:r>
+        <w:t xml:space="preserve"> </w:t>
+      </w:r>
+    </w:p>
+    <w:p>
+      <w:pPr>
+        <w:pStyle w:val="Code"/>
+      </w:pPr>
+      <w:r>
+        <w:t xml:space="preserve"># 2) Install (no-op if entry 36 already installed it).</w:t>
+      </w:r>
+    </w:p>
+    <w:p>
+      <w:pPr>
+        <w:pStyle w:val="Code"/>
+      </w:pPr>
+      <w:r>
+        <w:t xml:space="preserve">sudo apt update</w:t>
+      </w:r>
+    </w:p>
+    <w:p>
+      <w:pPr>
+        <w:pStyle w:val="Code"/>
+      </w:pPr>
+      <w:r>
+        <w:t xml:space="preserve">sudo apt install -y microsoft-edge-stable</w:t>
+      </w:r>
+    </w:p>
+    <w:p>
+      <w:r>
+        <w:rPr>
+          <w:i/>
+        </w:rPr>
+        <w:t xml:space="preserve">Note: VERIFIED ON THIS BUILD (2026-10-23): microsoft-edge-stable 156.0.4314.42-1 from https://packages.microsoft.com/repos/edge-stable, installed as a native .deb (dpkg -l shows 'ii'; no snap or Flatpak copy). It had been pulled in by entry 36; Edge updates through apt like any other package. START MENU (APP LIBRARY): the package ships two launchers in /usr/share/applications. microsoft-edge.desktop is the visible one; com.microsoft.Edge.desktop has NoDisplay=true and never shows. On this machine COSMIC's App Library had filed Edge inside the 'Office' folder (the cosmic-office group in ~/.config/cosmic/com.system76.CosmicAppLibrary/v1/groups lists 'microsoft-edge' under include), so it did not show on the Library Home screen. Decision on 2026-10-23: move it by hand -- open the App Library, open the Office folder and drag Edge out onto Library Home. This is not scripted, because the groups file holds the whole folder layout and rewriting it would overwrite other folder changes. To pin it to the Dock instead, right-click its icon and choose Pin, then add 'microsoft-edge' to the favorites list in entry 16. DEFAULT BROWSER SIDE EFFECT -- fixed in entry 38: the per-user default (mimeapps.list: text/html and http/https -&gt; chromium.desktop) stays Chromium after installing Edge. However, Edge registers itself with the Debian 'alternatives' system at priority 200, against Chromium's 40. In auto mode that silently made Edge the system-wide x-www-browser and gnome-www-browser. Anything that opens links through sensible-browser or x-www-browser (some CLI tools, older apps) therefore opened Edge even though Chromium was the default. Entry 38 sets those links explicitly. Edge also offers to become the default browser on first launch; entry 38 turns that prompt off when Chromium is chosen. VERIFY: dpkg -l microsoft-edge-stable; microsoft-edge --version; apt-cache policy microsoft-edge-stable (source should be packages.microsoft.com/repos/edge-stable). REVERT: sudo apt purge microsoft-edge-stable &amp;&amp; sudo rm -f /etc/apt/sources.list.d/microsoft-edge.sources /usr/share/keyrings/microsoft-edge.gpg (but not if entry 36 / Intune is in use: Conditional Access needs Edge), then re-run entry 38 with chromium.</w:t>
+      </w:r>
+    </w:p>
+    <w:p/>
+    <w:p>
+      <w:pPr>
+        <w:pStyle w:val="Heading2"/>
+      </w:pPr>
+      <w:r>
+        <w:t xml:space="preserve">38. Default web browser: choose Chromium or Edge</w:t>
+      </w:r>
+    </w:p>
+    <w:p>
+      <w:r>
+        <w:rPr>
+          <w:i/>
+        </w:rPr>
+        <w:t xml:space="preserve">Category: Browsers   |   Date: 2026-10-23   |   Method: xdg-settings / xdg-mime (user) + update-alternatives + Edge managed policy (sudo)</w:t>
+      </w:r>
+    </w:p>
+    <w:p>
+      <w:r>
+        <w:t xml:space="preserve">Sets the default web browser to one of the two browsers this build ships: Chromium (entry 7, the default choice) or Microsoft Edge (entry 37). One setting, DEFAULT_BROWSER ('chromium' or 'edge'), drives every place Linux records a default browser. These are the per-user default that COSMIC, xdg-open and most apps use (xdg-settings / mimeapps.list for http, https and HTML files) and the system-wide 'x-www-browser' and 'gnome-www-browser' links used by sensible-browser and older tools. When Chromium is chosen, it also sets an Edge policy so Edge stops asking to become the default.</w:t>
+      </w:r>
+    </w:p>
+    <w:p>
+      <w:pPr>
+        <w:pStyle w:val="Heading3"/>
+      </w:pPr>
+      <w:r>
+        <w:t xml:space="preserve">Commands</w:t>
+      </w:r>
+    </w:p>
+    <w:p>
+      <w:pPr>
+        <w:pStyle w:val="Code"/>
+      </w:pPr>
+      <w:r>
+        <w:t xml:space="preserve">BROWSER="chromium"</w:t>
+      </w:r>
+    </w:p>
+    <w:p>
+      <w:pPr>
+        <w:pStyle w:val="Code"/>
+      </w:pPr>
+      <w:r>
+        <w:t xml:space="preserve">case "$BROWSER" in</w:t>
+      </w:r>
+    </w:p>
+    <w:p>
+      <w:pPr>
+        <w:pStyle w:val="Code"/>
+      </w:pPr>
+      <w:r>
+        <w:t xml:space="preserve">    chromium) DESKTOP=chromium.desktop;       BIN=/usr/bin/chromium ;;</w:t>
+      </w:r>
+    </w:p>
+    <w:p>
+      <w:pPr>
+        <w:pStyle w:val="Code"/>
+      </w:pPr>
+      <w:r>
+        <w:t xml:space="preserve">    edge)     DESKTOP=microsoft-edge.desktop; BIN=/usr/bin/microsoft-edge-stable ;;</w:t>
+      </w:r>
+    </w:p>
+    <w:p>
+      <w:pPr>
+        <w:pStyle w:val="Code"/>
+      </w:pPr>
+      <w:r>
+        <w:t xml:space="preserve">    *) echo "    DEFAULT_BROWSER must be 'chromium' or 'edge' (got '$BROWSER')" &gt;&amp;2; exit 1 ;;</w:t>
+      </w:r>
+    </w:p>
+    <w:p>
+      <w:pPr>
+        <w:pStyle w:val="Code"/>
+      </w:pPr>
+      <w:r>
+        <w:t xml:space="preserve">esac</w:t>
+      </w:r>
+    </w:p>
+    <w:p>
+      <w:pPr>
+        <w:pStyle w:val="Code"/>
+      </w:pPr>
+      <w:r>
+        <w:t xml:space="preserve">if [ ! -x "$BIN" ]; then</w:t>
+      </w:r>
+    </w:p>
+    <w:p>
+      <w:pPr>
+        <w:pStyle w:val="Code"/>
+      </w:pPr>
+      <w:r>
+        <w:t xml:space="preserve">    echo "    $BIN is not installed -- run entry 7 (Chromium) or 37 (Edge) first" &gt;&amp;2; exit 1</w:t>
+      </w:r>
+    </w:p>
+    <w:p>
+      <w:pPr>
+        <w:pStyle w:val="Code"/>
+      </w:pPr>
+      <w:r>
+        <w:t xml:space="preserve">fi</w:t>
+      </w:r>
+    </w:p>
+    <w:p>
+      <w:pPr>
+        <w:pStyle w:val="Code"/>
+      </w:pPr>
+      <w:r>
+        <w:t xml:space="preserve"> </w:t>
+      </w:r>
+    </w:p>
+    <w:p>
+      <w:pPr>
+        <w:pStyle w:val="Code"/>
+      </w:pPr>
+      <w:r>
+        <w:t xml:space="preserve"># 1) Per-user default: what COSMIC, xdg-open and most apps follow.</w:t>
+      </w:r>
+    </w:p>
+    <w:p>
+      <w:pPr>
+        <w:pStyle w:val="Code"/>
+      </w:pPr>
+      <w:r>
+        <w:t xml:space="preserve">#    Run as the desktop user, never under sudo (writes ~/.config/mimeapps.list).</w:t>
+      </w:r>
+    </w:p>
+    <w:p>
+      <w:pPr>
+        <w:pStyle w:val="Code"/>
+      </w:pPr>
+      <w:r>
+        <w:t xml:space="preserve">xdg-settings set default-web-browser "$DESKTOP"</w:t>
+      </w:r>
+    </w:p>
+    <w:p>
+      <w:pPr>
+        <w:pStyle w:val="Code"/>
+      </w:pPr>
+      <w:r>
+        <w:t xml:space="preserve">for t in x-scheme-handler/http x-scheme-handler/https text/html application/xhtml+xml; do</w:t>
+      </w:r>
+    </w:p>
+    <w:p>
+      <w:pPr>
+        <w:pStyle w:val="Code"/>
+      </w:pPr>
+      <w:r>
+        <w:t xml:space="preserve">    xdg-mime default "$DESKTOP" "$t"</w:t>
+      </w:r>
+    </w:p>
+    <w:p>
+      <w:pPr>
+        <w:pStyle w:val="Code"/>
+      </w:pPr>
+      <w:r>
+        <w:t xml:space="preserve">done</w:t>
+      </w:r>
+    </w:p>
+    <w:p>
+      <w:pPr>
+        <w:pStyle w:val="Code"/>
+      </w:pPr>
+      <w:r>
+        <w:t xml:space="preserve"> </w:t>
+      </w:r>
+    </w:p>
+    <w:p>
+      <w:pPr>
+        <w:pStyle w:val="Code"/>
+      </w:pPr>
+      <w:r>
+        <w:t xml:space="preserve"># 2) System-wide fallback used by sensible-browser / x-www-browser. --set puts</w:t>
+      </w:r>
+    </w:p>
+    <w:p>
+      <w:pPr>
+        <w:pStyle w:val="Code"/>
+      </w:pPr>
+      <w:r>
+        <w:t xml:space="preserve">#    the link in manual mode, so a later browser upgrade cannot flip it back</w:t>
+      </w:r>
+    </w:p>
+    <w:p>
+      <w:pPr>
+        <w:pStyle w:val="Code"/>
+      </w:pPr>
+      <w:r>
+        <w:t xml:space="preserve">#    (Edge registers at priority 200 and would win in auto mode).</w:t>
+      </w:r>
+    </w:p>
+    <w:p>
+      <w:pPr>
+        <w:pStyle w:val="Code"/>
+      </w:pPr>
+      <w:r>
+        <w:t xml:space="preserve">sudo update-alternatives --set x-www-browser "$BIN"</w:t>
+      </w:r>
+    </w:p>
+    <w:p>
+      <w:pPr>
+        <w:pStyle w:val="Code"/>
+      </w:pPr>
+      <w:r>
+        <w:t xml:space="preserve">sudo update-alternatives --set gnome-www-browser "$BIN"</w:t>
+      </w:r>
+    </w:p>
+    <w:p>
+      <w:pPr>
+        <w:pStyle w:val="Code"/>
+      </w:pPr>
+      <w:r>
+        <w:t xml:space="preserve"> </w:t>
+      </w:r>
+    </w:p>
+    <w:p>
+      <w:pPr>
+        <w:pStyle w:val="Code"/>
+      </w:pPr>
+      <w:r>
+        <w:t xml:space="preserve"># 3) Edge's 'make me the default' prompt: off when Chromium is the default,</w:t>
+      </w:r>
+    </w:p>
+    <w:p>
+      <w:pPr>
+        <w:pStyle w:val="Code"/>
+      </w:pPr>
+      <w:r>
+        <w:t xml:space="preserve">#    back to normal when Edge is.</w:t>
+      </w:r>
+    </w:p>
+    <w:p>
+      <w:pPr>
+        <w:pStyle w:val="Code"/>
+      </w:pPr>
+      <w:r>
+        <w:t xml:space="preserve">POLICY=/etc/opt/edge/policies/managed/popinstall-default-browser.json</w:t>
+      </w:r>
+    </w:p>
+    <w:p>
+      <w:pPr>
+        <w:pStyle w:val="Code"/>
+      </w:pPr>
+      <w:r>
+        <w:t xml:space="preserve">if [ "$BROWSER" = chromium ] &amp;&amp; [ -x /usr/bin/microsoft-edge-stable ]; then</w:t>
+      </w:r>
+    </w:p>
+    <w:p>
+      <w:pPr>
+        <w:pStyle w:val="Code"/>
+      </w:pPr>
+      <w:r>
+        <w:t xml:space="preserve">    sudo install -d -m 755 /etc/opt/edge/policies/managed</w:t>
+      </w:r>
+    </w:p>
+    <w:p>
+      <w:pPr>
+        <w:pStyle w:val="Code"/>
+      </w:pPr>
+      <w:r>
+        <w:t xml:space="preserve">    echo '{ "DefaultBrowserSettingEnabled": false }' | sudo tee "$POLICY" &gt; /dev/null</w:t>
+      </w:r>
+    </w:p>
+    <w:p>
+      <w:pPr>
+        <w:pStyle w:val="Code"/>
+      </w:pPr>
+      <w:r>
+        <w:t xml:space="preserve">else</w:t>
+      </w:r>
+    </w:p>
+    <w:p>
+      <w:pPr>
+        <w:pStyle w:val="Code"/>
+      </w:pPr>
+      <w:r>
+        <w:t xml:space="preserve">    sudo rm -f "$POLICY"</w:t>
+      </w:r>
+    </w:p>
+    <w:p>
+      <w:pPr>
+        <w:pStyle w:val="Code"/>
+      </w:pPr>
+      <w:r>
+        <w:t xml:space="preserve">fi</w:t>
+      </w:r>
+    </w:p>
+    <w:p>
+      <w:pPr>
+        <w:pStyle w:val="Code"/>
+      </w:pPr>
+      <w:r>
+        <w:t xml:space="preserve">echo "    Default browser: $BROWSER ($(xdg-settings get default-web-browser))"</w:t>
+      </w:r>
+    </w:p>
+    <w:p>
+      <w:r>
+        <w:rPr>
+          <w:i/>
+        </w:rPr>
+        <w:t xml:space="preserve">Note: CHOOSING: the wizard asks for DEFAULT_BROWSER. Type 'chromium' (the default) or 'edge'; anything else stops the entry with an error. Plain install.sh uses the default, chromium. To switch later: ./install-wizard.py --only 38. The wizard remembers your last answer. WHY THREE PLACES: Linux has no single default-browser switch. (1) xdg-settings / mimeapps.list is the per-user setting that COSMIC Settings -&gt; Applications -&gt; Default Applications also edits; it is what clicking a link in most apps uses. xdg-settings alone sets http/https, so xdg-mime also sets text/html and application/xhtml+xml, which makes local .html files open in the same browser. (2) The Debian alternatives x-www-browser and gnome-www-browser are system-wide and are used by sensible-browser and some CLI tools. They were in auto mode, where the highest priority wins: Edge registers at 200 and Chromium at 40, so installing Edge silently took them over (found on this machine on 2026-10-23, while mimeapps.list still said Chromium). --set switches them to manual mode, which survives package upgrades. (3) /etc/opt/edge/policies/managed/*.json is Edge's Linux policy folder. DefaultBrowserSettingEnabled=false stops Edge checking or asking to be the default; edge://policy shows it as applied. It is removed again when Edge is chosen, so Edge's own 'Make default' button works. The filename is specific to this entry, so it never touches policies from other sources. SUDO SPLIT: steps 2 and 3 use sudo inline; step 1 must run as the logged-in user. Do not run this whole entry with sudo, or root's default changes instead of yours. Multi-user images need step 1 once per account. INTUNE (entry 36): Conditional Access only works in Edge. Keeping Chromium as the default is fine -- open work sites in Edge on purpose. VERIFY: xdg-settings get default-web-browser; xdg-mime query default text/html; update-alternatives --query x-www-browser | grep -E '^(Status|Value)' (expect 'manual' and the chosen binary); cat /etc/opt/edge/policies/managed/popinstall-default-browser.json (Chromium only). REVERT: sudo update-alternatives --auto x-www-browser &amp;&amp; sudo update-alternatives --auto gnome-www-browser &amp;&amp; sudo rm -f /etc/opt/edge/policies/managed/popinstall-default-browser.json.</w:t>
       </w:r>
     </w:p>
     <w:p/>

</xml_diff>

<commit_message>
Add entries 37-38: Microsoft Edge and default-browser choice (#3)
- 37: Microsoft Edge as an optional native .deb from Microsoft's repo,
  installable without the Intune entry. Notes cover the App Library
  (Edge lands in the Office folder; move it to Library Home by hand).
- 38: DEFAULT_BROWSER param (chromium | edge) sets mimeapps/xdg defaults,
  pins x-www-browser and gnome-www-browser in manual mode (Edge's
  priority 200 otherwise takes them over), and, for chromium, turns off
  Edge's "make default" prompt via a managed policy.
- README/CONTRIBUTING updated; install.sh and guide regenerated.

Co-authored-by: Jason Eames Lamarca <JasonEamesLamarca@users.noreply.github.com>
Co-authored-by: Claude Opus 5.5 <noreply@anthropic.com>
</commit_message>
<xml_diff>
--- a/docs/PopOS-Customization-Guide.docx
+++ b/docs/PopOS-Customization-Guide.docx
@@ -20,7 +20,7 @@
     </w:p>
     <w:p>
       <w:r>
-        <w:t xml:space="preserve">Generated: 2026-10-22 11:09 UTC</w:t>
+        <w:t xml:space="preserve">Generated: 2026-10-23 16:26 UTC</w:t>
       </w:r>
     </w:p>
     <w:p>
@@ -5539,6 +5539,466 @@
           <w:i/>
         </w:rPr>
         <w:t xml:space="preserve">Note: VERIFIED ON THIS BUILD (2026-10-22): the wizard run of this entry exited 0 and installed intune-portal 1.2609.5-noble, microsoft-identity-broker 3.0.2-noble, microsoft-edge-stable 155.0.4283.62-1 and libpam-pwquality 1.4.5-3build1. intune-daemon.socket, microsoft-identity-device-broker (system) and intune-agent.timer (user) were all active afterwards. After signing in through the Intune app, 'dsreg --status' reported 'Device Registration Status: Registered' and 'PRT Present: YES', and ~/.config/intune/registration.toml was written. REGISTERED IS NOT THE SAME AS COMPLIANT. Registration puts the device in Entra ID. A Conditional Access rule that requires a compliant device also needs the tenant's Linux compliance policy to pass; the Intune app shows the result and lists any failing setting. The intune-agent timer re-checks about every hour, so a fixed setting can take up to an hour to show as compliant (or use 'Refresh' in the app). POP!_OS CAVEATS -- read before relying on Conditional Access: (1) Microsoft supports Intune on Ubuntu Desktop, not Pop!_OS. The agent reports the distribution from /etc/os-release, so this machine shows as 'Pop!_OS 24.04 LTS'. If the compliance policy's 'Allowed distributions' only lists Ubuntu, the device will be non-compliant until an admin adds Pop!_OS. Do not edit /etc/os-release to get around it -- that misreports the device to your organisation and breaks Pop!_OS tooling. (2) The agent checks disk encryption by reading /proc/mounts for dm-crypt. A stock Pop!_OS install without the 'Encrypt drive' option, like the one this log was built on (only swap is encrypted), fails a 'Require device encryption' policy. That cannot be fixed by a script; it needs a reinstall with full-disk encryption. (3) The password policy check reads pam_pwquality settings (minlen, dcredit, ucredit, lcredit, ocredit) from /etc/security/pwquality.conf and the PAM stack. This entry installs the module but does not set values, because they must match your tenant's policy; if the app reports the password setting as failing, set those values in /etc/security/pwquality.conf, then change your password so the new rule applies. WHAT THE PACKAGES DO TO THE SYSTEM: intune-portal adds a PAM profile (pam_intune.so, applied with pam-auth-update), a polkit action, the system intune-daemon socket and the per-user intune-agent timer. The 'intune-daemon.service is a disabled or a static unit' message during install is expected -- the daemon is socket-activated. Its postinst also removes Microsoft repo files it would duplicate. microsoft-identity-broker adds the system device broker, the per-user broker (started on demand over D-Bus) and the 'dsreg' tool. Tokens are stored in GNOME Keyring through the Secret Service, which COSMIC runs by default. EDGE FOR WEB APPS: Conditional Access sees the device only from Edge. Sign in to the Edge profile with the same work account. Chromium (entry 7) will be blocked by 'require compliant device' rules. Edge is the one browser this build allows that is not from the Pop!_OS/xtradeb repos, and it is here only for this. Its package deletes the bootstrap microsoft-edge.list and writes its own /etc/apt/sources.list.d/microsoft-edge.sources and /usr/share/keyrings/microsoft-edge.gpg -- expected, not a duplicate. THE SIGN-IN IS DELIBERATELY NOT SCRIPTED: it needs live credentials and MFA, and nothing from it may go into entries.json or install.sh. registration.toml holds tenant and device IDs -- never commit it. UNENROLL / REVERT: in the Intune app use 'Remove device' (it retires the device in Intune and deletes it from Entra ID), then 'sudo apt purge intune-portal microsoft-identity-broker microsoft-edge-stable' and 'rm -rf ~/.config/intune ~/.local/state/intune'. Purging without removing the device first leaves a stale device in Entra ID for an admin to delete. NOT FOR IMAGE BUILDS: run this entry on the booted machine, not inside a Cubic or live-build chroot. Step 4's 'systemctl --now' needs a running systemd and fails in a chroot, which stops the script under 'set -e'. Enrollment also belongs to one machine and one user: each machine registers itself when its user signs in, and a registration must never be copied into an image. On a respin, skip entry 36 in the chroot and run './install-wizard.py --only 36' after first boot. VERIFY: dsreg --status (expect 'Registered' and 'PRT Present: YES'); systemctl status intune-daemon.socket microsoft-identity-device-broker; systemctl --user status intune-agent.timer; the Intune app's home screen for compliance status; and the device under Entra admin center -&gt; Devices -&gt; All devices.</w:t>
+      </w:r>
+    </w:p>
+    <w:p/>
+    <w:p>
+      <w:pPr>
+        <w:pStyle w:val="Heading2"/>
+      </w:pPr>
+      <w:r>
+        <w:t xml:space="preserve">37. Microsoft Edge (native .deb from Microsoft's repo, optional second browser)</w:t>
+      </w:r>
+    </w:p>
+    <w:p>
+      <w:r>
+        <w:rPr>
+          <w:i/>
+        </w:rPr>
+        <w:t xml:space="preserve">Category: Browsers   |   Date: 2026-10-23   |   Method: apt + microsoft edge repo</w:t>
+      </w:r>
+    </w:p>
+    <w:p>
+      <w:r>
+        <w:t xml:space="preserve">Installs Microsoft Edge as an optional second browser next to Chromium (entry 7), from Microsoft's own apt repository rather than a snap or Flatpak -- same native-packages-only rule as the rest of this build. Edge is useful on its own (Microsoft 365 web apps, sites that only test against Edge) and is required for Intune Conditional Access (entry 36, which also installs it). This entry lets Edge be picked on its own without enrolling in Intune. Installing Edge does NOT change the default browser for web links; see entry 38 to choose between Chromium and Edge.</w:t>
+      </w:r>
+    </w:p>
+    <w:p>
+      <w:pPr>
+        <w:pStyle w:val="Heading3"/>
+      </w:pPr>
+      <w:r>
+        <w:t xml:space="preserve">Commands</w:t>
+      </w:r>
+    </w:p>
+    <w:p>
+      <w:pPr>
+        <w:pStyle w:val="Code"/>
+      </w:pPr>
+      <w:r>
+        <w:t xml:space="preserve"># 1) Microsoft Edge repo. Bootstrap only: on install, Edge's own package</w:t>
+      </w:r>
+    </w:p>
+    <w:p>
+      <w:pPr>
+        <w:pStyle w:val="Code"/>
+      </w:pPr>
+      <w:r>
+        <w:t xml:space="preserve">#    replaces it with /etc/apt/sources.list.d/microsoft-edge.sources (own</w:t>
+      </w:r>
+    </w:p>
+    <w:p>
+      <w:pPr>
+        <w:pStyle w:val="Code"/>
+      </w:pPr>
+      <w:r>
+        <w:t xml:space="preserve">#    keyring, repos/edge-stable). Written only when no Edge source exists yet,</w:t>
+      </w:r>
+    </w:p>
+    <w:p>
+      <w:pPr>
+        <w:pStyle w:val="Code"/>
+      </w:pPr>
+      <w:r>
+        <w:t xml:space="preserve">#    so a re-run (or a machine that already ran entry 36) adds no duplicate.</w:t>
+      </w:r>
+    </w:p>
+    <w:p>
+      <w:pPr>
+        <w:pStyle w:val="Code"/>
+      </w:pPr>
+      <w:r>
+        <w:t xml:space="preserve">if ! ls /etc/apt/sources.list.d/microsoft-edge.* &gt; /dev/null 2&gt;&amp;1; then</w:t>
+      </w:r>
+    </w:p>
+    <w:p>
+      <w:pPr>
+        <w:pStyle w:val="Code"/>
+      </w:pPr>
+      <w:r>
+        <w:t xml:space="preserve">    [ -f /usr/share/keyrings/microsoft.gpg ] || \</w:t>
+      </w:r>
+    </w:p>
+    <w:p>
+      <w:pPr>
+        <w:pStyle w:val="Code"/>
+      </w:pPr>
+      <w:r>
+        <w:t xml:space="preserve">        wget -qO- https://packages.microsoft.com/keys/microsoft.asc | gpg --dearmor \</w:t>
+      </w:r>
+    </w:p>
+    <w:p>
+      <w:pPr>
+        <w:pStyle w:val="Code"/>
+      </w:pPr>
+      <w:r>
+        <w:t xml:space="preserve">        | sudo install -D -o root -g root -m 644 /dev/stdin /usr/share/keyrings/microsoft.gpg</w:t>
+      </w:r>
+    </w:p>
+    <w:p>
+      <w:pPr>
+        <w:pStyle w:val="Code"/>
+      </w:pPr>
+      <w:r>
+        <w:t xml:space="preserve">    echo "deb [arch=amd64 signed-by=/usr/share/keyrings/microsoft.gpg] https://packages.microsoft.com/repos/edge stable main" \</w:t>
+      </w:r>
+    </w:p>
+    <w:p>
+      <w:pPr>
+        <w:pStyle w:val="Code"/>
+      </w:pPr>
+      <w:r>
+        <w:t xml:space="preserve">        | sudo tee /etc/apt/sources.list.d/microsoft-edge.list &gt; /dev/null</w:t>
+      </w:r>
+    </w:p>
+    <w:p>
+      <w:pPr>
+        <w:pStyle w:val="Code"/>
+      </w:pPr>
+      <w:r>
+        <w:t xml:space="preserve">fi</w:t>
+      </w:r>
+    </w:p>
+    <w:p>
+      <w:pPr>
+        <w:pStyle w:val="Code"/>
+      </w:pPr>
+      <w:r>
+        <w:t xml:space="preserve"> </w:t>
+      </w:r>
+    </w:p>
+    <w:p>
+      <w:pPr>
+        <w:pStyle w:val="Code"/>
+      </w:pPr>
+      <w:r>
+        <w:t xml:space="preserve"># 2) Install (no-op if entry 36 already installed it).</w:t>
+      </w:r>
+    </w:p>
+    <w:p>
+      <w:pPr>
+        <w:pStyle w:val="Code"/>
+      </w:pPr>
+      <w:r>
+        <w:t xml:space="preserve">sudo apt update</w:t>
+      </w:r>
+    </w:p>
+    <w:p>
+      <w:pPr>
+        <w:pStyle w:val="Code"/>
+      </w:pPr>
+      <w:r>
+        <w:t xml:space="preserve">sudo apt install -y microsoft-edge-stable</w:t>
+      </w:r>
+    </w:p>
+    <w:p>
+      <w:r>
+        <w:rPr>
+          <w:i/>
+        </w:rPr>
+        <w:t xml:space="preserve">Note: VERIFIED ON THIS BUILD (2026-10-23): microsoft-edge-stable 156.0.4314.42-1 from https://packages.microsoft.com/repos/edge-stable, installed as a native .deb (dpkg -l shows 'ii'; no snap or Flatpak copy). It had been pulled in by entry 36; Edge updates through apt like any other package. START MENU (APP LIBRARY): the package ships two launchers in /usr/share/applications. microsoft-edge.desktop is the visible one; com.microsoft.Edge.desktop has NoDisplay=true and never shows. On this machine COSMIC's App Library had filed Edge inside the 'Office' folder (the cosmic-office group in ~/.config/cosmic/com.system76.CosmicAppLibrary/v1/groups lists 'microsoft-edge' under include), so it did not show on the Library Home screen. Decision on 2026-10-23: move it by hand -- open the App Library, open the Office folder and drag Edge out onto Library Home. This is not scripted, because the groups file holds the whole folder layout and rewriting it would overwrite other folder changes. To pin it to the Dock instead, right-click its icon and choose Pin, then add 'microsoft-edge' to the favorites list in entry 16. DEFAULT BROWSER SIDE EFFECT -- fixed in entry 38: the per-user default (mimeapps.list: text/html and http/https -&gt; chromium.desktop) stays Chromium after installing Edge. However, Edge registers itself with the Debian 'alternatives' system at priority 200, against Chromium's 40. In auto mode that silently made Edge the system-wide x-www-browser and gnome-www-browser. Anything that opens links through sensible-browser or x-www-browser (some CLI tools, older apps) therefore opened Edge even though Chromium was the default. Entry 38 sets those links explicitly. Edge also offers to become the default browser on first launch; entry 38 turns that prompt off when Chromium is chosen. VERIFY: dpkg -l microsoft-edge-stable; microsoft-edge --version; apt-cache policy microsoft-edge-stable (source should be packages.microsoft.com/repos/edge-stable). REVERT: sudo apt purge microsoft-edge-stable &amp;&amp; sudo rm -f /etc/apt/sources.list.d/microsoft-edge.sources /usr/share/keyrings/microsoft-edge.gpg (but not if entry 36 / Intune is in use: Conditional Access needs Edge), then re-run entry 38 with chromium.</w:t>
+      </w:r>
+    </w:p>
+    <w:p/>
+    <w:p>
+      <w:pPr>
+        <w:pStyle w:val="Heading2"/>
+      </w:pPr>
+      <w:r>
+        <w:t xml:space="preserve">38. Default web browser: choose Chromium or Edge</w:t>
+      </w:r>
+    </w:p>
+    <w:p>
+      <w:r>
+        <w:rPr>
+          <w:i/>
+        </w:rPr>
+        <w:t xml:space="preserve">Category: Browsers   |   Date: 2026-10-23   |   Method: xdg-settings / xdg-mime (user) + update-alternatives + Edge managed policy (sudo)</w:t>
+      </w:r>
+    </w:p>
+    <w:p>
+      <w:r>
+        <w:t xml:space="preserve">Sets the default web browser to one of the two browsers this build ships: Chromium (entry 7, the default choice) or Microsoft Edge (entry 37). One setting, DEFAULT_BROWSER ('chromium' or 'edge'), drives every place Linux records a default browser. These are the per-user default that COSMIC, xdg-open and most apps use (xdg-settings / mimeapps.list for http, https and HTML files) and the system-wide 'x-www-browser' and 'gnome-www-browser' links used by sensible-browser and older tools. When Chromium is chosen, it also sets an Edge policy so Edge stops asking to become the default.</w:t>
+      </w:r>
+    </w:p>
+    <w:p>
+      <w:pPr>
+        <w:pStyle w:val="Heading3"/>
+      </w:pPr>
+      <w:r>
+        <w:t xml:space="preserve">Commands</w:t>
+      </w:r>
+    </w:p>
+    <w:p>
+      <w:pPr>
+        <w:pStyle w:val="Code"/>
+      </w:pPr>
+      <w:r>
+        <w:t xml:space="preserve">BROWSER="chromium"</w:t>
+      </w:r>
+    </w:p>
+    <w:p>
+      <w:pPr>
+        <w:pStyle w:val="Code"/>
+      </w:pPr>
+      <w:r>
+        <w:t xml:space="preserve">case "$BROWSER" in</w:t>
+      </w:r>
+    </w:p>
+    <w:p>
+      <w:pPr>
+        <w:pStyle w:val="Code"/>
+      </w:pPr>
+      <w:r>
+        <w:t xml:space="preserve">    chromium) DESKTOP=chromium.desktop;       BIN=/usr/bin/chromium ;;</w:t>
+      </w:r>
+    </w:p>
+    <w:p>
+      <w:pPr>
+        <w:pStyle w:val="Code"/>
+      </w:pPr>
+      <w:r>
+        <w:t xml:space="preserve">    edge)     DESKTOP=microsoft-edge.desktop; BIN=/usr/bin/microsoft-edge-stable ;;</w:t>
+      </w:r>
+    </w:p>
+    <w:p>
+      <w:pPr>
+        <w:pStyle w:val="Code"/>
+      </w:pPr>
+      <w:r>
+        <w:t xml:space="preserve">    *) echo "    DEFAULT_BROWSER must be 'chromium' or 'edge' (got '$BROWSER')" &gt;&amp;2; exit 1 ;;</w:t>
+      </w:r>
+    </w:p>
+    <w:p>
+      <w:pPr>
+        <w:pStyle w:val="Code"/>
+      </w:pPr>
+      <w:r>
+        <w:t xml:space="preserve">esac</w:t>
+      </w:r>
+    </w:p>
+    <w:p>
+      <w:pPr>
+        <w:pStyle w:val="Code"/>
+      </w:pPr>
+      <w:r>
+        <w:t xml:space="preserve">if [ ! -x "$BIN" ]; then</w:t>
+      </w:r>
+    </w:p>
+    <w:p>
+      <w:pPr>
+        <w:pStyle w:val="Code"/>
+      </w:pPr>
+      <w:r>
+        <w:t xml:space="preserve">    echo "    $BIN is not installed -- run entry 7 (Chromium) or 37 (Edge) first" &gt;&amp;2; exit 1</w:t>
+      </w:r>
+    </w:p>
+    <w:p>
+      <w:pPr>
+        <w:pStyle w:val="Code"/>
+      </w:pPr>
+      <w:r>
+        <w:t xml:space="preserve">fi</w:t>
+      </w:r>
+    </w:p>
+    <w:p>
+      <w:pPr>
+        <w:pStyle w:val="Code"/>
+      </w:pPr>
+      <w:r>
+        <w:t xml:space="preserve"> </w:t>
+      </w:r>
+    </w:p>
+    <w:p>
+      <w:pPr>
+        <w:pStyle w:val="Code"/>
+      </w:pPr>
+      <w:r>
+        <w:t xml:space="preserve"># 1) Per-user default: what COSMIC, xdg-open and most apps follow.</w:t>
+      </w:r>
+    </w:p>
+    <w:p>
+      <w:pPr>
+        <w:pStyle w:val="Code"/>
+      </w:pPr>
+      <w:r>
+        <w:t xml:space="preserve">#    Run as the desktop user, never under sudo (writes ~/.config/mimeapps.list).</w:t>
+      </w:r>
+    </w:p>
+    <w:p>
+      <w:pPr>
+        <w:pStyle w:val="Code"/>
+      </w:pPr>
+      <w:r>
+        <w:t xml:space="preserve">xdg-settings set default-web-browser "$DESKTOP"</w:t>
+      </w:r>
+    </w:p>
+    <w:p>
+      <w:pPr>
+        <w:pStyle w:val="Code"/>
+      </w:pPr>
+      <w:r>
+        <w:t xml:space="preserve">for t in x-scheme-handler/http x-scheme-handler/https text/html application/xhtml+xml; do</w:t>
+      </w:r>
+    </w:p>
+    <w:p>
+      <w:pPr>
+        <w:pStyle w:val="Code"/>
+      </w:pPr>
+      <w:r>
+        <w:t xml:space="preserve">    xdg-mime default "$DESKTOP" "$t"</w:t>
+      </w:r>
+    </w:p>
+    <w:p>
+      <w:pPr>
+        <w:pStyle w:val="Code"/>
+      </w:pPr>
+      <w:r>
+        <w:t xml:space="preserve">done</w:t>
+      </w:r>
+    </w:p>
+    <w:p>
+      <w:pPr>
+        <w:pStyle w:val="Code"/>
+      </w:pPr>
+      <w:r>
+        <w:t xml:space="preserve"> </w:t>
+      </w:r>
+    </w:p>
+    <w:p>
+      <w:pPr>
+        <w:pStyle w:val="Code"/>
+      </w:pPr>
+      <w:r>
+        <w:t xml:space="preserve"># 2) System-wide fallback used by sensible-browser / x-www-browser. --set puts</w:t>
+      </w:r>
+    </w:p>
+    <w:p>
+      <w:pPr>
+        <w:pStyle w:val="Code"/>
+      </w:pPr>
+      <w:r>
+        <w:t xml:space="preserve">#    the link in manual mode, so a later browser upgrade cannot flip it back</w:t>
+      </w:r>
+    </w:p>
+    <w:p>
+      <w:pPr>
+        <w:pStyle w:val="Code"/>
+      </w:pPr>
+      <w:r>
+        <w:t xml:space="preserve">#    (Edge registers at priority 200 and would win in auto mode).</w:t>
+      </w:r>
+    </w:p>
+    <w:p>
+      <w:pPr>
+        <w:pStyle w:val="Code"/>
+      </w:pPr>
+      <w:r>
+        <w:t xml:space="preserve">sudo update-alternatives --set x-www-browser "$BIN"</w:t>
+      </w:r>
+    </w:p>
+    <w:p>
+      <w:pPr>
+        <w:pStyle w:val="Code"/>
+      </w:pPr>
+      <w:r>
+        <w:t xml:space="preserve">sudo update-alternatives --set gnome-www-browser "$BIN"</w:t>
+      </w:r>
+    </w:p>
+    <w:p>
+      <w:pPr>
+        <w:pStyle w:val="Code"/>
+      </w:pPr>
+      <w:r>
+        <w:t xml:space="preserve"> </w:t>
+      </w:r>
+    </w:p>
+    <w:p>
+      <w:pPr>
+        <w:pStyle w:val="Code"/>
+      </w:pPr>
+      <w:r>
+        <w:t xml:space="preserve"># 3) Edge's 'make me the default' prompt: off when Chromium is the default,</w:t>
+      </w:r>
+    </w:p>
+    <w:p>
+      <w:pPr>
+        <w:pStyle w:val="Code"/>
+      </w:pPr>
+      <w:r>
+        <w:t xml:space="preserve">#    back to normal when Edge is.</w:t>
+      </w:r>
+    </w:p>
+    <w:p>
+      <w:pPr>
+        <w:pStyle w:val="Code"/>
+      </w:pPr>
+      <w:r>
+        <w:t xml:space="preserve">POLICY=/etc/opt/edge/policies/managed/popinstall-default-browser.json</w:t>
+      </w:r>
+    </w:p>
+    <w:p>
+      <w:pPr>
+        <w:pStyle w:val="Code"/>
+      </w:pPr>
+      <w:r>
+        <w:t xml:space="preserve">if [ "$BROWSER" = chromium ] &amp;&amp; [ -x /usr/bin/microsoft-edge-stable ]; then</w:t>
+      </w:r>
+    </w:p>
+    <w:p>
+      <w:pPr>
+        <w:pStyle w:val="Code"/>
+      </w:pPr>
+      <w:r>
+        <w:t xml:space="preserve">    sudo install -d -m 755 /etc/opt/edge/policies/managed</w:t>
+      </w:r>
+    </w:p>
+    <w:p>
+      <w:pPr>
+        <w:pStyle w:val="Code"/>
+      </w:pPr>
+      <w:r>
+        <w:t xml:space="preserve">    echo '{ "DefaultBrowserSettingEnabled": false }' | sudo tee "$POLICY" &gt; /dev/null</w:t>
+      </w:r>
+    </w:p>
+    <w:p>
+      <w:pPr>
+        <w:pStyle w:val="Code"/>
+      </w:pPr>
+      <w:r>
+        <w:t xml:space="preserve">else</w:t>
+      </w:r>
+    </w:p>
+    <w:p>
+      <w:pPr>
+        <w:pStyle w:val="Code"/>
+      </w:pPr>
+      <w:r>
+        <w:t xml:space="preserve">    sudo rm -f "$POLICY"</w:t>
+      </w:r>
+    </w:p>
+    <w:p>
+      <w:pPr>
+        <w:pStyle w:val="Code"/>
+      </w:pPr>
+      <w:r>
+        <w:t xml:space="preserve">fi</w:t>
+      </w:r>
+    </w:p>
+    <w:p>
+      <w:pPr>
+        <w:pStyle w:val="Code"/>
+      </w:pPr>
+      <w:r>
+        <w:t xml:space="preserve">echo "    Default browser: $BROWSER ($(xdg-settings get default-web-browser))"</w:t>
+      </w:r>
+    </w:p>
+    <w:p>
+      <w:r>
+        <w:rPr>
+          <w:i/>
+        </w:rPr>
+        <w:t xml:space="preserve">Note: CHOOSING: the wizard asks for DEFAULT_BROWSER. Type 'chromium' (the default) or 'edge'; anything else stops the entry with an error. Plain install.sh uses the default, chromium. To switch later: ./install-wizard.py --only 38. The wizard remembers your last answer. WHY THREE PLACES: Linux has no single default-browser switch. (1) xdg-settings / mimeapps.list is the per-user setting that COSMIC Settings -&gt; Applications -&gt; Default Applications also edits; it is what clicking a link in most apps uses. xdg-settings alone sets http/https, so xdg-mime also sets text/html and application/xhtml+xml, which makes local .html files open in the same browser. (2) The Debian alternatives x-www-browser and gnome-www-browser are system-wide and are used by sensible-browser and some CLI tools. They were in auto mode, where the highest priority wins: Edge registers at 200 and Chromium at 40, so installing Edge silently took them over (found on this machine on 2026-10-23, while mimeapps.list still said Chromium). --set switches them to manual mode, which survives package upgrades. (3) /etc/opt/edge/policies/managed/*.json is Edge's Linux policy folder. DefaultBrowserSettingEnabled=false stops Edge checking or asking to be the default; edge://policy shows it as applied. It is removed again when Edge is chosen, so Edge's own 'Make default' button works. The filename is specific to this entry, so it never touches policies from other sources. SUDO SPLIT: steps 2 and 3 use sudo inline; step 1 must run as the logged-in user. Do not run this whole entry with sudo, or root's default changes instead of yours. Multi-user images need step 1 once per account. INTUNE (entry 36): Conditional Access only works in Edge. Keeping Chromium as the default is fine -- open work sites in Edge on purpose. VERIFY: xdg-settings get default-web-browser; xdg-mime query default text/html; update-alternatives --query x-www-browser | grep -E '^(Status|Value)' (expect 'manual' and the chosen binary); cat /etc/opt/edge/policies/managed/popinstall-default-browser.json (Chromium only). REVERT: sudo update-alternatives --auto x-www-browser &amp;&amp; sudo update-alternatives --auto gnome-www-browser &amp;&amp; sudo rm -f /etc/opt/edge/policies/managed/popinstall-default-browser.json.</w:t>
       </w:r>
     </w:p>
     <w:p/>

</xml_diff>